<commit_message>
Surjection 0.8.0: blog post, page features, before/after in demo report
Co-Authored-By: Claude Sonnet 5.5 <noreply@anthropic.com>
Claude-Session: https://claude.ai/code/session_01XRjzoChLXqYFXuqS5cZKst
</commit_message>
<xml_diff>
--- a/public/demos/surjection/surjection-report-example.docx
+++ b/public/demos/surjection/surjection-report-example.docx
@@ -36,7 +36,7 @@
         <w:spacing w:after="120"/>
       </w:pPr>
       <w:r>
-        <w:t xml:space="preserve">Datum: 5. Oktober 2026</w:t>
+        <w:t xml:space="preserve">Datum: 6. Oktober 2026</w:t>
       </w:r>
     </w:p>
     <w:p>
@@ -214,7 +214,7 @@
         <w:spacing w:after="120" w:before="240"/>
       </w:pPr>
       <w:r>
-        <w:t xml:space="preserve">Schwer: Elemente müssen einen ausreichenden Farbkontrast haben.</w:t>
+        <w:t xml:space="preserve">Schwer: Elements must meet minimum color contrast ratio thresholds</w:t>
       </w:r>
     </w:p>
     <w:p>
@@ -234,7 +234,7 @@
         <w:spacing w:after="120"/>
       </w:pPr>
       <w:r>
-        <w:t xml:space="preserve">Stellt sicher, dass der Kontrast zwischen Vorder- und Hintergrundfarbe den in der WCAG 2 als AA ausgewiesenen Kontrastgrenzwerten entspricht.</w:t>
+        <w:t xml:space="preserve">Ensure the contrast between foreground and background colors meets WCAG 2 AA minimum contrast ratio thresholds</w:t>
       </w:r>
     </w:p>
     <w:p>
@@ -270,15 +270,15 @@
         <w:spacing w:after="120"/>
       </w:pPr>
       <w:r>
-        <w:t xml:space="preserve">Korrigiere mindestens einen der folgenden Punkte:
-  Das Element hat einen unzureichenden Kontrast von 2.01 (Vordergrundfarbe: #b5b5b5, Hintergrundfarbe: #fffdf8, Schriftgröße: 12.0pt (16px), Schriftstärke: normal). Erwartetes Kontrastverhältnis von 4.5:1</w:t>
+        <w:t xml:space="preserve">Fix any of the following:
+  Element has insufficient color contrast of 2.01 (foreground color: #b5b5b5, background color: #fffdf8, font size: 12.0pt (16px), font weight: normal). Expected contrast ratio of 4.5:1</w:t>
       </w:r>
     </w:p>
     <w:p>
       <w:r>
         <w:drawing>
           <wp:inline distT="0" distB="0" distL="0" distR="0">
-            <wp:extent cx="4000500" cy="285750"/>
+            <wp:extent cx="3562350" cy="457200"/>
             <wp:effectExtent t="0" r="0" b="0" l="0"/>
             <wp:docPr id="1" name="Screenshot des betroffenen Elements" descr="Screenshot des betroffenen Elements: p" title="Screenshot des betroffenen Elements"/>
             <wp:cNvGraphicFramePr>
@@ -303,7 +303,7 @@
                   <pic:spPr bwMode="auto">
                     <a:xfrm>
                       <a:off x="0" y="0"/>
-                      <a:ext cx="4000500" cy="285750"/>
+                      <a:ext cx="3562350" cy="457200"/>
                     </a:xfrm>
                     <a:prstGeom prst="rect">
                       <a:avLst/>
@@ -320,7 +320,7 @@
       <w:pPr>
         <w:spacing w:after="200"/>
       </w:pPr>
-      <w:hyperlink w:history="1" r:id="rIdcgolobt5x-n19pkhubby4">
+      <w:hyperlink w:history="1" r:id="rIdoc_fghlzuntawp5ezrkha">
         <w:r>
           <w:rPr>
             <w:rStyle w:val="Hyperlink"/>
@@ -328,6 +328,632 @@
           <w:t xml:space="preserve">Weitere Informationen: color-contrast</w:t>
         </w:r>
       </w:hyperlink>
+    </w:p>
+    <w:p>
+      <w:pPr>
+        <w:pStyle w:val="Heading1"/>
+        <w:spacing w:after="120" w:before="240"/>
+      </w:pPr>
+      <w:r>
+        <w:t xml:space="preserve">Behobene Probleme</w:t>
+      </w:r>
+    </w:p>
+    <w:p>
+      <w:pPr>
+        <w:spacing w:after="120"/>
+      </w:pPr>
+      <w:r>
+        <w:t xml:space="preserve">5 Probleme aus dem letzten Bericht sind behoben.</w:t>
+      </w:r>
+    </w:p>
+    <w:p>
+      <w:pPr>
+        <w:pStyle w:val="Heading2"/>
+        <w:spacing w:after="120" w:before="240"/>
+      </w:pPr>
+      <w:r>
+        <w:t xml:space="preserve">Bäckerei Muster</w:t>
+      </w:r>
+    </w:p>
+    <w:p>
+      <w:pPr>
+        <w:spacing w:after="120"/>
+      </w:pPr>
+      <w:r>
+        <w:rPr>
+          <w:b/>
+          <w:bCs/>
+        </w:rPr>
+        <w:t xml:space="preserve">Buttons must have discernible text (.icon)</w:t>
+      </w:r>
+    </w:p>
+    <w:p>
+      <w:pPr>
+        <w:spacing w:after="120"/>
+      </w:pPr>
+      <w:r>
+        <w:rPr>
+          <w:i/>
+          <w:iCs/>
+        </w:rPr>
+        <w:t xml:space="preserve">Vorher</w:t>
+      </w:r>
+    </w:p>
+    <w:p>
+      <w:r>
+        <w:drawing>
+          <wp:inline distT="0" distB="0" distL="0" distR="0">
+            <wp:extent cx="571500" cy="571500"/>
+            <wp:effectExtent t="0" r="0" b="0" l="0"/>
+            <wp:docPr id="2" name="Vorher" descr="Vorher: .icon" title="Vorher"/>
+            <wp:cNvGraphicFramePr>
+              <a:graphicFrameLocks xmlns:a="http://schemas.openxmlformats.org/drawingml/2006/main" noChangeAspect="1"/>
+            </wp:cNvGraphicFramePr>
+            <a:graphic xmlns:a="http://schemas.openxmlformats.org/drawingml/2006/main">
+              <a:graphicData uri="http://schemas.openxmlformats.org/drawingml/2006/picture">
+                <pic:pic xmlns:pic="http://schemas.openxmlformats.org/drawingml/2006/picture">
+                  <pic:nvPicPr>
+                    <pic:cNvPr id="0" name="" descr=""/>
+                    <pic:cNvPicPr>
+                      <a:picLocks noChangeAspect="1" noChangeArrowheads="1"/>
+                    </pic:cNvPicPr>
+                  </pic:nvPicPr>
+                  <pic:blipFill>
+                    <a:blip r:embed="rId8" cstate="none"/>
+                    <a:srcRect/>
+                    <a:stretch>
+                      <a:fillRect/>
+                    </a:stretch>
+                  </pic:blipFill>
+                  <pic:spPr bwMode="auto">
+                    <a:xfrm>
+                      <a:off x="0" y="0"/>
+                      <a:ext cx="571500" cy="571500"/>
+                    </a:xfrm>
+                    <a:prstGeom prst="rect">
+                      <a:avLst/>
+                    </a:prstGeom>
+                  </pic:spPr>
+                </pic:pic>
+              </a:graphicData>
+            </a:graphic>
+          </wp:inline>
+        </w:drawing>
+      </w:r>
+    </w:p>
+    <w:p>
+      <w:pPr>
+        <w:spacing w:after="120"/>
+      </w:pPr>
+      <w:r>
+        <w:rPr>
+          <w:i/>
+          <w:iCs/>
+        </w:rPr>
+        <w:t xml:space="preserve">Nachher</w:t>
+      </w:r>
+    </w:p>
+    <w:p>
+      <w:r>
+        <w:drawing>
+          <wp:inline distT="0" distB="0" distL="0" distR="0">
+            <wp:extent cx="571500" cy="571500"/>
+            <wp:effectExtent t="0" r="0" b="0" l="0"/>
+            <wp:docPr id="3" name="Nachher" descr="Nachher: .icon" title="Nachher"/>
+            <wp:cNvGraphicFramePr>
+              <a:graphicFrameLocks xmlns:a="http://schemas.openxmlformats.org/drawingml/2006/main" noChangeAspect="1"/>
+            </wp:cNvGraphicFramePr>
+            <a:graphic xmlns:a="http://schemas.openxmlformats.org/drawingml/2006/main">
+              <a:graphicData uri="http://schemas.openxmlformats.org/drawingml/2006/picture">
+                <pic:pic xmlns:pic="http://schemas.openxmlformats.org/drawingml/2006/picture">
+                  <pic:nvPicPr>
+                    <pic:cNvPr id="0" name="" descr=""/>
+                    <pic:cNvPicPr>
+                      <a:picLocks noChangeAspect="1" noChangeArrowheads="1"/>
+                    </pic:cNvPicPr>
+                  </pic:nvPicPr>
+                  <pic:blipFill>
+                    <a:blip r:embed="rId8" cstate="none"/>
+                    <a:srcRect/>
+                    <a:stretch>
+                      <a:fillRect/>
+                    </a:stretch>
+                  </pic:blipFill>
+                  <pic:spPr bwMode="auto">
+                    <a:xfrm>
+                      <a:off x="0" y="0"/>
+                      <a:ext cx="571500" cy="571500"/>
+                    </a:xfrm>
+                    <a:prstGeom prst="rect">
+                      <a:avLst/>
+                    </a:prstGeom>
+                  </pic:spPr>
+                </pic:pic>
+              </a:graphicData>
+            </a:graphic>
+          </wp:inline>
+        </w:drawing>
+      </w:r>
+    </w:p>
+    <w:p>
+      <w:pPr>
+        <w:spacing w:after="120"/>
+      </w:pPr>
+      <w:r>
+        <w:rPr>
+          <w:b/>
+          <w:bCs/>
+        </w:rPr>
+        <w:t xml:space="preserve">Images must have alternative text (img)</w:t>
+      </w:r>
+    </w:p>
+    <w:p>
+      <w:pPr>
+        <w:spacing w:after="120"/>
+      </w:pPr>
+      <w:r>
+        <w:rPr>
+          <w:i/>
+          <w:iCs/>
+        </w:rPr>
+        <w:t xml:space="preserve">Vorher</w:t>
+      </w:r>
+    </w:p>
+    <w:p>
+      <w:r>
+        <w:drawing>
+          <wp:inline distT="0" distB="0" distL="0" distR="0">
+            <wp:extent cx="3562350" cy="1895475"/>
+            <wp:effectExtent t="0" r="0" b="0" l="0"/>
+            <wp:docPr id="4" name="Vorher" descr="Vorher: img" title="Vorher"/>
+            <wp:cNvGraphicFramePr>
+              <a:graphicFrameLocks xmlns:a="http://schemas.openxmlformats.org/drawingml/2006/main" noChangeAspect="1"/>
+            </wp:cNvGraphicFramePr>
+            <a:graphic xmlns:a="http://schemas.openxmlformats.org/drawingml/2006/main">
+              <a:graphicData uri="http://schemas.openxmlformats.org/drawingml/2006/picture">
+                <pic:pic xmlns:pic="http://schemas.openxmlformats.org/drawingml/2006/picture">
+                  <pic:nvPicPr>
+                    <pic:cNvPr id="0" name="" descr=""/>
+                    <pic:cNvPicPr>
+                      <a:picLocks noChangeAspect="1" noChangeArrowheads="1"/>
+                    </pic:cNvPicPr>
+                  </pic:nvPicPr>
+                  <pic:blipFill>
+                    <a:blip r:embed="rId9" cstate="none"/>
+                    <a:srcRect/>
+                    <a:stretch>
+                      <a:fillRect/>
+                    </a:stretch>
+                  </pic:blipFill>
+                  <pic:spPr bwMode="auto">
+                    <a:xfrm>
+                      <a:off x="0" y="0"/>
+                      <a:ext cx="3562350" cy="1895475"/>
+                    </a:xfrm>
+                    <a:prstGeom prst="rect">
+                      <a:avLst/>
+                    </a:prstGeom>
+                  </pic:spPr>
+                </pic:pic>
+              </a:graphicData>
+            </a:graphic>
+          </wp:inline>
+        </w:drawing>
+      </w:r>
+    </w:p>
+    <w:p>
+      <w:pPr>
+        <w:spacing w:after="120"/>
+      </w:pPr>
+      <w:r>
+        <w:rPr>
+          <w:i/>
+          <w:iCs/>
+        </w:rPr>
+        <w:t xml:space="preserve">Nachher</w:t>
+      </w:r>
+    </w:p>
+    <w:p>
+      <w:r>
+        <w:drawing>
+          <wp:inline distT="0" distB="0" distL="0" distR="0">
+            <wp:extent cx="3562350" cy="1895475"/>
+            <wp:effectExtent t="0" r="0" b="0" l="0"/>
+            <wp:docPr id="5" name="Nachher" descr="Nachher: img" title="Nachher"/>
+            <wp:cNvGraphicFramePr>
+              <a:graphicFrameLocks xmlns:a="http://schemas.openxmlformats.org/drawingml/2006/main" noChangeAspect="1"/>
+            </wp:cNvGraphicFramePr>
+            <a:graphic xmlns:a="http://schemas.openxmlformats.org/drawingml/2006/main">
+              <a:graphicData uri="http://schemas.openxmlformats.org/drawingml/2006/picture">
+                <pic:pic xmlns:pic="http://schemas.openxmlformats.org/drawingml/2006/picture">
+                  <pic:nvPicPr>
+                    <pic:cNvPr id="0" name="" descr=""/>
+                    <pic:cNvPicPr>
+                      <a:picLocks noChangeAspect="1" noChangeArrowheads="1"/>
+                    </pic:cNvPicPr>
+                  </pic:nvPicPr>
+                  <pic:blipFill>
+                    <a:blip r:embed="rId9" cstate="none"/>
+                    <a:srcRect/>
+                    <a:stretch>
+                      <a:fillRect/>
+                    </a:stretch>
+                  </pic:blipFill>
+                  <pic:spPr bwMode="auto">
+                    <a:xfrm>
+                      <a:off x="0" y="0"/>
+                      <a:ext cx="3562350" cy="1895475"/>
+                    </a:xfrm>
+                    <a:prstGeom prst="rect">
+                      <a:avLst/>
+                    </a:prstGeom>
+                  </pic:spPr>
+                </pic:pic>
+              </a:graphicData>
+            </a:graphic>
+          </wp:inline>
+        </w:drawing>
+      </w:r>
+    </w:p>
+    <w:p>
+      <w:pPr>
+        <w:spacing w:after="120"/>
+      </w:pPr>
+      <w:r>
+        <w:rPr>
+          <w:b/>
+          <w:bCs/>
+        </w:rPr>
+        <w:t xml:space="preserve">Form elements must have labels (input)</w:t>
+      </w:r>
+    </w:p>
+    <w:p>
+      <w:pPr>
+        <w:spacing w:after="120"/>
+      </w:pPr>
+      <w:r>
+        <w:rPr>
+          <w:i/>
+          <w:iCs/>
+        </w:rPr>
+        <w:t xml:space="preserve">Vorher</w:t>
+      </w:r>
+    </w:p>
+    <w:p>
+      <w:r>
+        <w:drawing>
+          <wp:inline distT="0" distB="0" distL="0" distR="0">
+            <wp:extent cx="2095500" cy="571500"/>
+            <wp:effectExtent t="0" r="0" b="0" l="0"/>
+            <wp:docPr id="6" name="Vorher" descr="Vorher: input" title="Vorher"/>
+            <wp:cNvGraphicFramePr>
+              <a:graphicFrameLocks xmlns:a="http://schemas.openxmlformats.org/drawingml/2006/main" noChangeAspect="1"/>
+            </wp:cNvGraphicFramePr>
+            <a:graphic xmlns:a="http://schemas.openxmlformats.org/drawingml/2006/main">
+              <a:graphicData uri="http://schemas.openxmlformats.org/drawingml/2006/picture">
+                <pic:pic xmlns:pic="http://schemas.openxmlformats.org/drawingml/2006/picture">
+                  <pic:nvPicPr>
+                    <pic:cNvPr id="0" name="" descr=""/>
+                    <pic:cNvPicPr>
+                      <a:picLocks noChangeAspect="1" noChangeArrowheads="1"/>
+                    </pic:cNvPicPr>
+                  </pic:nvPicPr>
+                  <pic:blipFill>
+                    <a:blip r:embed="rId10" cstate="none"/>
+                    <a:srcRect/>
+                    <a:stretch>
+                      <a:fillRect/>
+                    </a:stretch>
+                  </pic:blipFill>
+                  <pic:spPr bwMode="auto">
+                    <a:xfrm>
+                      <a:off x="0" y="0"/>
+                      <a:ext cx="2095500" cy="571500"/>
+                    </a:xfrm>
+                    <a:prstGeom prst="rect">
+                      <a:avLst/>
+                    </a:prstGeom>
+                  </pic:spPr>
+                </pic:pic>
+              </a:graphicData>
+            </a:graphic>
+          </wp:inline>
+        </w:drawing>
+      </w:r>
+    </w:p>
+    <w:p>
+      <w:pPr>
+        <w:spacing w:after="120"/>
+      </w:pPr>
+      <w:r>
+        <w:rPr>
+          <w:i/>
+          <w:iCs/>
+        </w:rPr>
+        <w:t xml:space="preserve">Nachher</w:t>
+      </w:r>
+    </w:p>
+    <w:p>
+      <w:r>
+        <w:drawing>
+          <wp:inline distT="0" distB="0" distL="0" distR="0">
+            <wp:extent cx="2095500" cy="571500"/>
+            <wp:effectExtent t="0" r="0" b="0" l="0"/>
+            <wp:docPr id="7" name="Nachher" descr="Nachher: input" title="Nachher"/>
+            <wp:cNvGraphicFramePr>
+              <a:graphicFrameLocks xmlns:a="http://schemas.openxmlformats.org/drawingml/2006/main" noChangeAspect="1"/>
+            </wp:cNvGraphicFramePr>
+            <a:graphic xmlns:a="http://schemas.openxmlformats.org/drawingml/2006/main">
+              <a:graphicData uri="http://schemas.openxmlformats.org/drawingml/2006/picture">
+                <pic:pic xmlns:pic="http://schemas.openxmlformats.org/drawingml/2006/picture">
+                  <pic:nvPicPr>
+                    <pic:cNvPr id="0" name="" descr=""/>
+                    <pic:cNvPicPr>
+                      <a:picLocks noChangeAspect="1" noChangeArrowheads="1"/>
+                    </pic:cNvPicPr>
+                  </pic:nvPicPr>
+                  <pic:blipFill>
+                    <a:blip r:embed="rId10" cstate="none"/>
+                    <a:srcRect/>
+                    <a:stretch>
+                      <a:fillRect/>
+                    </a:stretch>
+                  </pic:blipFill>
+                  <pic:spPr bwMode="auto">
+                    <a:xfrm>
+                      <a:off x="0" y="0"/>
+                      <a:ext cx="2095500" cy="571500"/>
+                    </a:xfrm>
+                    <a:prstGeom prst="rect">
+                      <a:avLst/>
+                    </a:prstGeom>
+                  </pic:spPr>
+                </pic:pic>
+              </a:graphicData>
+            </a:graphic>
+          </wp:inline>
+        </w:drawing>
+      </w:r>
+    </w:p>
+    <w:p>
+      <w:pPr>
+        <w:spacing w:after="120"/>
+      </w:pPr>
+      <w:r>
+        <w:rPr>
+          <w:b/>
+          <w:bCs/>
+        </w:rPr>
+        <w:t xml:space="preserve">&lt;html&gt; element must have a lang attribute (html)</w:t>
+      </w:r>
+    </w:p>
+    <w:p>
+      <w:pPr>
+        <w:spacing w:after="120"/>
+      </w:pPr>
+      <w:r>
+        <w:rPr>
+          <w:i/>
+          <w:iCs/>
+        </w:rPr>
+        <w:t xml:space="preserve">Vorher</w:t>
+      </w:r>
+    </w:p>
+    <w:p>
+      <w:r>
+        <w:drawing>
+          <wp:inline distT="0" distB="0" distL="0" distR="0">
+            <wp:extent cx="3714750" cy="4762500"/>
+            <wp:effectExtent t="0" r="0" b="0" l="0"/>
+            <wp:docPr id="8" name="Vorher" descr="Vorher: html" title="Vorher"/>
+            <wp:cNvGraphicFramePr>
+              <a:graphicFrameLocks xmlns:a="http://schemas.openxmlformats.org/drawingml/2006/main" noChangeAspect="1"/>
+            </wp:cNvGraphicFramePr>
+            <a:graphic xmlns:a="http://schemas.openxmlformats.org/drawingml/2006/main">
+              <a:graphicData uri="http://schemas.openxmlformats.org/drawingml/2006/picture">
+                <pic:pic xmlns:pic="http://schemas.openxmlformats.org/drawingml/2006/picture">
+                  <pic:nvPicPr>
+                    <pic:cNvPr id="0" name="" descr=""/>
+                    <pic:cNvPicPr>
+                      <a:picLocks noChangeAspect="1" noChangeArrowheads="1"/>
+                    </pic:cNvPicPr>
+                  </pic:nvPicPr>
+                  <pic:blipFill>
+                    <a:blip r:embed="rId11" cstate="none"/>
+                    <a:srcRect/>
+                    <a:stretch>
+                      <a:fillRect/>
+                    </a:stretch>
+                  </pic:blipFill>
+                  <pic:spPr bwMode="auto">
+                    <a:xfrm>
+                      <a:off x="0" y="0"/>
+                      <a:ext cx="3714750" cy="4762500"/>
+                    </a:xfrm>
+                    <a:prstGeom prst="rect">
+                      <a:avLst/>
+                    </a:prstGeom>
+                  </pic:spPr>
+                </pic:pic>
+              </a:graphicData>
+            </a:graphic>
+          </wp:inline>
+        </w:drawing>
+      </w:r>
+    </w:p>
+    <w:p>
+      <w:pPr>
+        <w:spacing w:after="120"/>
+      </w:pPr>
+      <w:r>
+        <w:rPr>
+          <w:i/>
+          <w:iCs/>
+        </w:rPr>
+        <w:t xml:space="preserve">Nachher</w:t>
+      </w:r>
+    </w:p>
+    <w:p>
+      <w:r>
+        <w:drawing>
+          <wp:inline distT="0" distB="0" distL="0" distR="0">
+            <wp:extent cx="3714750" cy="4762500"/>
+            <wp:effectExtent t="0" r="0" b="0" l="0"/>
+            <wp:docPr id="9" name="Nachher" descr="Nachher: html" title="Nachher"/>
+            <wp:cNvGraphicFramePr>
+              <a:graphicFrameLocks xmlns:a="http://schemas.openxmlformats.org/drawingml/2006/main" noChangeAspect="1"/>
+            </wp:cNvGraphicFramePr>
+            <a:graphic xmlns:a="http://schemas.openxmlformats.org/drawingml/2006/main">
+              <a:graphicData uri="http://schemas.openxmlformats.org/drawingml/2006/picture">
+                <pic:pic xmlns:pic="http://schemas.openxmlformats.org/drawingml/2006/picture">
+                  <pic:nvPicPr>
+                    <pic:cNvPr id="0" name="" descr=""/>
+                    <pic:cNvPicPr>
+                      <a:picLocks noChangeAspect="1" noChangeArrowheads="1"/>
+                    </pic:cNvPicPr>
+                  </pic:nvPicPr>
+                  <pic:blipFill>
+                    <a:blip r:embed="rId11" cstate="none"/>
+                    <a:srcRect/>
+                    <a:stretch>
+                      <a:fillRect/>
+                    </a:stretch>
+                  </pic:blipFill>
+                  <pic:spPr bwMode="auto">
+                    <a:xfrm>
+                      <a:off x="0" y="0"/>
+                      <a:ext cx="3714750" cy="4762500"/>
+                    </a:xfrm>
+                    <a:prstGeom prst="rect">
+                      <a:avLst/>
+                    </a:prstGeom>
+                  </pic:spPr>
+                </pic:pic>
+              </a:graphicData>
+            </a:graphic>
+          </wp:inline>
+        </w:drawing>
+      </w:r>
+    </w:p>
+    <w:p>
+      <w:pPr>
+        <w:spacing w:after="120"/>
+      </w:pPr>
+      <w:r>
+        <w:rPr>
+          <w:b/>
+          <w:bCs/>
+        </w:rPr>
+        <w:t xml:space="preserve">Links must have discernible text (a)</w:t>
+      </w:r>
+    </w:p>
+    <w:p>
+      <w:pPr>
+        <w:spacing w:after="120"/>
+      </w:pPr>
+      <w:r>
+        <w:rPr>
+          <w:i/>
+          <w:iCs/>
+        </w:rPr>
+        <w:t xml:space="preserve">Vorher</w:t>
+      </w:r>
+    </w:p>
+    <w:p>
+      <w:r>
+        <w:drawing>
+          <wp:inline distT="0" distB="0" distL="0" distR="0">
+            <wp:extent cx="381000" cy="409575"/>
+            <wp:effectExtent t="0" r="0" b="0" l="0"/>
+            <wp:docPr id="10" name="Vorher" descr="Vorher: a" title="Vorher"/>
+            <wp:cNvGraphicFramePr>
+              <a:graphicFrameLocks xmlns:a="http://schemas.openxmlformats.org/drawingml/2006/main" noChangeAspect="1"/>
+            </wp:cNvGraphicFramePr>
+            <a:graphic xmlns:a="http://schemas.openxmlformats.org/drawingml/2006/main">
+              <a:graphicData uri="http://schemas.openxmlformats.org/drawingml/2006/picture">
+                <pic:pic xmlns:pic="http://schemas.openxmlformats.org/drawingml/2006/picture">
+                  <pic:nvPicPr>
+                    <pic:cNvPr id="0" name="" descr=""/>
+                    <pic:cNvPicPr>
+                      <a:picLocks noChangeAspect="1" noChangeArrowheads="1"/>
+                    </pic:cNvPicPr>
+                  </pic:nvPicPr>
+                  <pic:blipFill>
+                    <a:blip r:embed="rId12" cstate="none"/>
+                    <a:srcRect/>
+                    <a:stretch>
+                      <a:fillRect/>
+                    </a:stretch>
+                  </pic:blipFill>
+                  <pic:spPr bwMode="auto">
+                    <a:xfrm>
+                      <a:off x="0" y="0"/>
+                      <a:ext cx="381000" cy="409575"/>
+                    </a:xfrm>
+                    <a:prstGeom prst="rect">
+                      <a:avLst/>
+                    </a:prstGeom>
+                  </pic:spPr>
+                </pic:pic>
+              </a:graphicData>
+            </a:graphic>
+          </wp:inline>
+        </w:drawing>
+      </w:r>
+    </w:p>
+    <w:p>
+      <w:pPr>
+        <w:spacing w:after="120"/>
+      </w:pPr>
+      <w:r>
+        <w:rPr>
+          <w:i/>
+          <w:iCs/>
+        </w:rPr>
+        <w:t xml:space="preserve">Nachher</w:t>
+      </w:r>
+    </w:p>
+    <w:p>
+      <w:r>
+        <w:drawing>
+          <wp:inline distT="0" distB="0" distL="0" distR="0">
+            <wp:extent cx="1162050" cy="409575"/>
+            <wp:effectExtent t="0" r="0" b="0" l="0"/>
+            <wp:docPr id="11" name="Nachher" descr="Nachher: a" title="Nachher"/>
+            <wp:cNvGraphicFramePr>
+              <a:graphicFrameLocks xmlns:a="http://schemas.openxmlformats.org/drawingml/2006/main" noChangeAspect="1"/>
+            </wp:cNvGraphicFramePr>
+            <a:graphic xmlns:a="http://schemas.openxmlformats.org/drawingml/2006/main">
+              <a:graphicData uri="http://schemas.openxmlformats.org/drawingml/2006/picture">
+                <pic:pic xmlns:pic="http://schemas.openxmlformats.org/drawingml/2006/picture">
+                  <pic:nvPicPr>
+                    <pic:cNvPr id="0" name="" descr=""/>
+                    <pic:cNvPicPr>
+                      <a:picLocks noChangeAspect="1" noChangeArrowheads="1"/>
+                    </pic:cNvPicPr>
+                  </pic:nvPicPr>
+                  <pic:blipFill>
+                    <a:blip r:embed="rId13" cstate="none"/>
+                    <a:srcRect/>
+                    <a:stretch>
+                      <a:fillRect/>
+                    </a:stretch>
+                  </pic:blipFill>
+                  <pic:spPr bwMode="auto">
+                    <a:xfrm>
+                      <a:off x="0" y="0"/>
+                      <a:ext cx="1162050" cy="409575"/>
+                    </a:xfrm>
+                    <a:prstGeom prst="rect">
+                      <a:avLst/>
+                    </a:prstGeom>
+                  </pic:spPr>
+                </pic:pic>
+              </a:graphicData>
+            </a:graphic>
+          </wp:inline>
+        </w:drawing>
+      </w:r>
     </w:p>
     <w:p>
       <w:pPr>

</xml_diff>

<commit_message>
Surjection 0.8.0: blog post, page features, before/after in demo report (#212)
Claude-Session: https://claude.ai/code/session_01XRjzoChLXqYFXuqS5cZKst

Co-authored-by: Claude <noreply@anthropic.com>
</commit_message>
<xml_diff>
--- a/public/demos/surjection/surjection-report-example.docx
+++ b/public/demos/surjection/surjection-report-example.docx
@@ -36,7 +36,7 @@
         <w:spacing w:after="120"/>
       </w:pPr>
       <w:r>
-        <w:t xml:space="preserve">Datum: 5. Oktober 2026</w:t>
+        <w:t xml:space="preserve">Datum: 6. Oktober 2026</w:t>
       </w:r>
     </w:p>
     <w:p>
@@ -214,7 +214,7 @@
         <w:spacing w:after="120" w:before="240"/>
       </w:pPr>
       <w:r>
-        <w:t xml:space="preserve">Schwer: Elemente müssen einen ausreichenden Farbkontrast haben.</w:t>
+        <w:t xml:space="preserve">Schwer: Elements must meet minimum color contrast ratio thresholds</w:t>
       </w:r>
     </w:p>
     <w:p>
@@ -234,7 +234,7 @@
         <w:spacing w:after="120"/>
       </w:pPr>
       <w:r>
-        <w:t xml:space="preserve">Stellt sicher, dass der Kontrast zwischen Vorder- und Hintergrundfarbe den in der WCAG 2 als AA ausgewiesenen Kontrastgrenzwerten entspricht.</w:t>
+        <w:t xml:space="preserve">Ensure the contrast between foreground and background colors meets WCAG 2 AA minimum contrast ratio thresholds</w:t>
       </w:r>
     </w:p>
     <w:p>
@@ -270,15 +270,15 @@
         <w:spacing w:after="120"/>
       </w:pPr>
       <w:r>
-        <w:t xml:space="preserve">Korrigiere mindestens einen der folgenden Punkte:
-  Das Element hat einen unzureichenden Kontrast von 2.01 (Vordergrundfarbe: #b5b5b5, Hintergrundfarbe: #fffdf8, Schriftgröße: 12.0pt (16px), Schriftstärke: normal). Erwartetes Kontrastverhältnis von 4.5:1</w:t>
+        <w:t xml:space="preserve">Fix any of the following:
+  Element has insufficient color contrast of 2.01 (foreground color: #b5b5b5, background color: #fffdf8, font size: 12.0pt (16px), font weight: normal). Expected contrast ratio of 4.5:1</w:t>
       </w:r>
     </w:p>
     <w:p>
       <w:r>
         <w:drawing>
           <wp:inline distT="0" distB="0" distL="0" distR="0">
-            <wp:extent cx="4000500" cy="285750"/>
+            <wp:extent cx="3562350" cy="457200"/>
             <wp:effectExtent t="0" r="0" b="0" l="0"/>
             <wp:docPr id="1" name="Screenshot des betroffenen Elements" descr="Screenshot des betroffenen Elements: p" title="Screenshot des betroffenen Elements"/>
             <wp:cNvGraphicFramePr>
@@ -303,7 +303,7 @@
                   <pic:spPr bwMode="auto">
                     <a:xfrm>
                       <a:off x="0" y="0"/>
-                      <a:ext cx="4000500" cy="285750"/>
+                      <a:ext cx="3562350" cy="457200"/>
                     </a:xfrm>
                     <a:prstGeom prst="rect">
                       <a:avLst/>
@@ -320,7 +320,7 @@
       <w:pPr>
         <w:spacing w:after="200"/>
       </w:pPr>
-      <w:hyperlink w:history="1" r:id="rIdcgolobt5x-n19pkhubby4">
+      <w:hyperlink w:history="1" r:id="rIdoc_fghlzuntawp5ezrkha">
         <w:r>
           <w:rPr>
             <w:rStyle w:val="Hyperlink"/>
@@ -328,6 +328,632 @@
           <w:t xml:space="preserve">Weitere Informationen: color-contrast</w:t>
         </w:r>
       </w:hyperlink>
+    </w:p>
+    <w:p>
+      <w:pPr>
+        <w:pStyle w:val="Heading1"/>
+        <w:spacing w:after="120" w:before="240"/>
+      </w:pPr>
+      <w:r>
+        <w:t xml:space="preserve">Behobene Probleme</w:t>
+      </w:r>
+    </w:p>
+    <w:p>
+      <w:pPr>
+        <w:spacing w:after="120"/>
+      </w:pPr>
+      <w:r>
+        <w:t xml:space="preserve">5 Probleme aus dem letzten Bericht sind behoben.</w:t>
+      </w:r>
+    </w:p>
+    <w:p>
+      <w:pPr>
+        <w:pStyle w:val="Heading2"/>
+        <w:spacing w:after="120" w:before="240"/>
+      </w:pPr>
+      <w:r>
+        <w:t xml:space="preserve">Bäckerei Muster</w:t>
+      </w:r>
+    </w:p>
+    <w:p>
+      <w:pPr>
+        <w:spacing w:after="120"/>
+      </w:pPr>
+      <w:r>
+        <w:rPr>
+          <w:b/>
+          <w:bCs/>
+        </w:rPr>
+        <w:t xml:space="preserve">Buttons must have discernible text (.icon)</w:t>
+      </w:r>
+    </w:p>
+    <w:p>
+      <w:pPr>
+        <w:spacing w:after="120"/>
+      </w:pPr>
+      <w:r>
+        <w:rPr>
+          <w:i/>
+          <w:iCs/>
+        </w:rPr>
+        <w:t xml:space="preserve">Vorher</w:t>
+      </w:r>
+    </w:p>
+    <w:p>
+      <w:r>
+        <w:drawing>
+          <wp:inline distT="0" distB="0" distL="0" distR="0">
+            <wp:extent cx="571500" cy="571500"/>
+            <wp:effectExtent t="0" r="0" b="0" l="0"/>
+            <wp:docPr id="2" name="Vorher" descr="Vorher: .icon" title="Vorher"/>
+            <wp:cNvGraphicFramePr>
+              <a:graphicFrameLocks xmlns:a="http://schemas.openxmlformats.org/drawingml/2006/main" noChangeAspect="1"/>
+            </wp:cNvGraphicFramePr>
+            <a:graphic xmlns:a="http://schemas.openxmlformats.org/drawingml/2006/main">
+              <a:graphicData uri="http://schemas.openxmlformats.org/drawingml/2006/picture">
+                <pic:pic xmlns:pic="http://schemas.openxmlformats.org/drawingml/2006/picture">
+                  <pic:nvPicPr>
+                    <pic:cNvPr id="0" name="" descr=""/>
+                    <pic:cNvPicPr>
+                      <a:picLocks noChangeAspect="1" noChangeArrowheads="1"/>
+                    </pic:cNvPicPr>
+                  </pic:nvPicPr>
+                  <pic:blipFill>
+                    <a:blip r:embed="rId8" cstate="none"/>
+                    <a:srcRect/>
+                    <a:stretch>
+                      <a:fillRect/>
+                    </a:stretch>
+                  </pic:blipFill>
+                  <pic:spPr bwMode="auto">
+                    <a:xfrm>
+                      <a:off x="0" y="0"/>
+                      <a:ext cx="571500" cy="571500"/>
+                    </a:xfrm>
+                    <a:prstGeom prst="rect">
+                      <a:avLst/>
+                    </a:prstGeom>
+                  </pic:spPr>
+                </pic:pic>
+              </a:graphicData>
+            </a:graphic>
+          </wp:inline>
+        </w:drawing>
+      </w:r>
+    </w:p>
+    <w:p>
+      <w:pPr>
+        <w:spacing w:after="120"/>
+      </w:pPr>
+      <w:r>
+        <w:rPr>
+          <w:i/>
+          <w:iCs/>
+        </w:rPr>
+        <w:t xml:space="preserve">Nachher</w:t>
+      </w:r>
+    </w:p>
+    <w:p>
+      <w:r>
+        <w:drawing>
+          <wp:inline distT="0" distB="0" distL="0" distR="0">
+            <wp:extent cx="571500" cy="571500"/>
+            <wp:effectExtent t="0" r="0" b="0" l="0"/>
+            <wp:docPr id="3" name="Nachher" descr="Nachher: .icon" title="Nachher"/>
+            <wp:cNvGraphicFramePr>
+              <a:graphicFrameLocks xmlns:a="http://schemas.openxmlformats.org/drawingml/2006/main" noChangeAspect="1"/>
+            </wp:cNvGraphicFramePr>
+            <a:graphic xmlns:a="http://schemas.openxmlformats.org/drawingml/2006/main">
+              <a:graphicData uri="http://schemas.openxmlformats.org/drawingml/2006/picture">
+                <pic:pic xmlns:pic="http://schemas.openxmlformats.org/drawingml/2006/picture">
+                  <pic:nvPicPr>
+                    <pic:cNvPr id="0" name="" descr=""/>
+                    <pic:cNvPicPr>
+                      <a:picLocks noChangeAspect="1" noChangeArrowheads="1"/>
+                    </pic:cNvPicPr>
+                  </pic:nvPicPr>
+                  <pic:blipFill>
+                    <a:blip r:embed="rId8" cstate="none"/>
+                    <a:srcRect/>
+                    <a:stretch>
+                      <a:fillRect/>
+                    </a:stretch>
+                  </pic:blipFill>
+                  <pic:spPr bwMode="auto">
+                    <a:xfrm>
+                      <a:off x="0" y="0"/>
+                      <a:ext cx="571500" cy="571500"/>
+                    </a:xfrm>
+                    <a:prstGeom prst="rect">
+                      <a:avLst/>
+                    </a:prstGeom>
+                  </pic:spPr>
+                </pic:pic>
+              </a:graphicData>
+            </a:graphic>
+          </wp:inline>
+        </w:drawing>
+      </w:r>
+    </w:p>
+    <w:p>
+      <w:pPr>
+        <w:spacing w:after="120"/>
+      </w:pPr>
+      <w:r>
+        <w:rPr>
+          <w:b/>
+          <w:bCs/>
+        </w:rPr>
+        <w:t xml:space="preserve">Images must have alternative text (img)</w:t>
+      </w:r>
+    </w:p>
+    <w:p>
+      <w:pPr>
+        <w:spacing w:after="120"/>
+      </w:pPr>
+      <w:r>
+        <w:rPr>
+          <w:i/>
+          <w:iCs/>
+        </w:rPr>
+        <w:t xml:space="preserve">Vorher</w:t>
+      </w:r>
+    </w:p>
+    <w:p>
+      <w:r>
+        <w:drawing>
+          <wp:inline distT="0" distB="0" distL="0" distR="0">
+            <wp:extent cx="3562350" cy="1895475"/>
+            <wp:effectExtent t="0" r="0" b="0" l="0"/>
+            <wp:docPr id="4" name="Vorher" descr="Vorher: img" title="Vorher"/>
+            <wp:cNvGraphicFramePr>
+              <a:graphicFrameLocks xmlns:a="http://schemas.openxmlformats.org/drawingml/2006/main" noChangeAspect="1"/>
+            </wp:cNvGraphicFramePr>
+            <a:graphic xmlns:a="http://schemas.openxmlformats.org/drawingml/2006/main">
+              <a:graphicData uri="http://schemas.openxmlformats.org/drawingml/2006/picture">
+                <pic:pic xmlns:pic="http://schemas.openxmlformats.org/drawingml/2006/picture">
+                  <pic:nvPicPr>
+                    <pic:cNvPr id="0" name="" descr=""/>
+                    <pic:cNvPicPr>
+                      <a:picLocks noChangeAspect="1" noChangeArrowheads="1"/>
+                    </pic:cNvPicPr>
+                  </pic:nvPicPr>
+                  <pic:blipFill>
+                    <a:blip r:embed="rId9" cstate="none"/>
+                    <a:srcRect/>
+                    <a:stretch>
+                      <a:fillRect/>
+                    </a:stretch>
+                  </pic:blipFill>
+                  <pic:spPr bwMode="auto">
+                    <a:xfrm>
+                      <a:off x="0" y="0"/>
+                      <a:ext cx="3562350" cy="1895475"/>
+                    </a:xfrm>
+                    <a:prstGeom prst="rect">
+                      <a:avLst/>
+                    </a:prstGeom>
+                  </pic:spPr>
+                </pic:pic>
+              </a:graphicData>
+            </a:graphic>
+          </wp:inline>
+        </w:drawing>
+      </w:r>
+    </w:p>
+    <w:p>
+      <w:pPr>
+        <w:spacing w:after="120"/>
+      </w:pPr>
+      <w:r>
+        <w:rPr>
+          <w:i/>
+          <w:iCs/>
+        </w:rPr>
+        <w:t xml:space="preserve">Nachher</w:t>
+      </w:r>
+    </w:p>
+    <w:p>
+      <w:r>
+        <w:drawing>
+          <wp:inline distT="0" distB="0" distL="0" distR="0">
+            <wp:extent cx="3562350" cy="1895475"/>
+            <wp:effectExtent t="0" r="0" b="0" l="0"/>
+            <wp:docPr id="5" name="Nachher" descr="Nachher: img" title="Nachher"/>
+            <wp:cNvGraphicFramePr>
+              <a:graphicFrameLocks xmlns:a="http://schemas.openxmlformats.org/drawingml/2006/main" noChangeAspect="1"/>
+            </wp:cNvGraphicFramePr>
+            <a:graphic xmlns:a="http://schemas.openxmlformats.org/drawingml/2006/main">
+              <a:graphicData uri="http://schemas.openxmlformats.org/drawingml/2006/picture">
+                <pic:pic xmlns:pic="http://schemas.openxmlformats.org/drawingml/2006/picture">
+                  <pic:nvPicPr>
+                    <pic:cNvPr id="0" name="" descr=""/>
+                    <pic:cNvPicPr>
+                      <a:picLocks noChangeAspect="1" noChangeArrowheads="1"/>
+                    </pic:cNvPicPr>
+                  </pic:nvPicPr>
+                  <pic:blipFill>
+                    <a:blip r:embed="rId9" cstate="none"/>
+                    <a:srcRect/>
+                    <a:stretch>
+                      <a:fillRect/>
+                    </a:stretch>
+                  </pic:blipFill>
+                  <pic:spPr bwMode="auto">
+                    <a:xfrm>
+                      <a:off x="0" y="0"/>
+                      <a:ext cx="3562350" cy="1895475"/>
+                    </a:xfrm>
+                    <a:prstGeom prst="rect">
+                      <a:avLst/>
+                    </a:prstGeom>
+                  </pic:spPr>
+                </pic:pic>
+              </a:graphicData>
+            </a:graphic>
+          </wp:inline>
+        </w:drawing>
+      </w:r>
+    </w:p>
+    <w:p>
+      <w:pPr>
+        <w:spacing w:after="120"/>
+      </w:pPr>
+      <w:r>
+        <w:rPr>
+          <w:b/>
+          <w:bCs/>
+        </w:rPr>
+        <w:t xml:space="preserve">Form elements must have labels (input)</w:t>
+      </w:r>
+    </w:p>
+    <w:p>
+      <w:pPr>
+        <w:spacing w:after="120"/>
+      </w:pPr>
+      <w:r>
+        <w:rPr>
+          <w:i/>
+          <w:iCs/>
+        </w:rPr>
+        <w:t xml:space="preserve">Vorher</w:t>
+      </w:r>
+    </w:p>
+    <w:p>
+      <w:r>
+        <w:drawing>
+          <wp:inline distT="0" distB="0" distL="0" distR="0">
+            <wp:extent cx="2095500" cy="571500"/>
+            <wp:effectExtent t="0" r="0" b="0" l="0"/>
+            <wp:docPr id="6" name="Vorher" descr="Vorher: input" title="Vorher"/>
+            <wp:cNvGraphicFramePr>
+              <a:graphicFrameLocks xmlns:a="http://schemas.openxmlformats.org/drawingml/2006/main" noChangeAspect="1"/>
+            </wp:cNvGraphicFramePr>
+            <a:graphic xmlns:a="http://schemas.openxmlformats.org/drawingml/2006/main">
+              <a:graphicData uri="http://schemas.openxmlformats.org/drawingml/2006/picture">
+                <pic:pic xmlns:pic="http://schemas.openxmlformats.org/drawingml/2006/picture">
+                  <pic:nvPicPr>
+                    <pic:cNvPr id="0" name="" descr=""/>
+                    <pic:cNvPicPr>
+                      <a:picLocks noChangeAspect="1" noChangeArrowheads="1"/>
+                    </pic:cNvPicPr>
+                  </pic:nvPicPr>
+                  <pic:blipFill>
+                    <a:blip r:embed="rId10" cstate="none"/>
+                    <a:srcRect/>
+                    <a:stretch>
+                      <a:fillRect/>
+                    </a:stretch>
+                  </pic:blipFill>
+                  <pic:spPr bwMode="auto">
+                    <a:xfrm>
+                      <a:off x="0" y="0"/>
+                      <a:ext cx="2095500" cy="571500"/>
+                    </a:xfrm>
+                    <a:prstGeom prst="rect">
+                      <a:avLst/>
+                    </a:prstGeom>
+                  </pic:spPr>
+                </pic:pic>
+              </a:graphicData>
+            </a:graphic>
+          </wp:inline>
+        </w:drawing>
+      </w:r>
+    </w:p>
+    <w:p>
+      <w:pPr>
+        <w:spacing w:after="120"/>
+      </w:pPr>
+      <w:r>
+        <w:rPr>
+          <w:i/>
+          <w:iCs/>
+        </w:rPr>
+        <w:t xml:space="preserve">Nachher</w:t>
+      </w:r>
+    </w:p>
+    <w:p>
+      <w:r>
+        <w:drawing>
+          <wp:inline distT="0" distB="0" distL="0" distR="0">
+            <wp:extent cx="2095500" cy="571500"/>
+            <wp:effectExtent t="0" r="0" b="0" l="0"/>
+            <wp:docPr id="7" name="Nachher" descr="Nachher: input" title="Nachher"/>
+            <wp:cNvGraphicFramePr>
+              <a:graphicFrameLocks xmlns:a="http://schemas.openxmlformats.org/drawingml/2006/main" noChangeAspect="1"/>
+            </wp:cNvGraphicFramePr>
+            <a:graphic xmlns:a="http://schemas.openxmlformats.org/drawingml/2006/main">
+              <a:graphicData uri="http://schemas.openxmlformats.org/drawingml/2006/picture">
+                <pic:pic xmlns:pic="http://schemas.openxmlformats.org/drawingml/2006/picture">
+                  <pic:nvPicPr>
+                    <pic:cNvPr id="0" name="" descr=""/>
+                    <pic:cNvPicPr>
+                      <a:picLocks noChangeAspect="1" noChangeArrowheads="1"/>
+                    </pic:cNvPicPr>
+                  </pic:nvPicPr>
+                  <pic:blipFill>
+                    <a:blip r:embed="rId10" cstate="none"/>
+                    <a:srcRect/>
+                    <a:stretch>
+                      <a:fillRect/>
+                    </a:stretch>
+                  </pic:blipFill>
+                  <pic:spPr bwMode="auto">
+                    <a:xfrm>
+                      <a:off x="0" y="0"/>
+                      <a:ext cx="2095500" cy="571500"/>
+                    </a:xfrm>
+                    <a:prstGeom prst="rect">
+                      <a:avLst/>
+                    </a:prstGeom>
+                  </pic:spPr>
+                </pic:pic>
+              </a:graphicData>
+            </a:graphic>
+          </wp:inline>
+        </w:drawing>
+      </w:r>
+    </w:p>
+    <w:p>
+      <w:pPr>
+        <w:spacing w:after="120"/>
+      </w:pPr>
+      <w:r>
+        <w:rPr>
+          <w:b/>
+          <w:bCs/>
+        </w:rPr>
+        <w:t xml:space="preserve">&lt;html&gt; element must have a lang attribute (html)</w:t>
+      </w:r>
+    </w:p>
+    <w:p>
+      <w:pPr>
+        <w:spacing w:after="120"/>
+      </w:pPr>
+      <w:r>
+        <w:rPr>
+          <w:i/>
+          <w:iCs/>
+        </w:rPr>
+        <w:t xml:space="preserve">Vorher</w:t>
+      </w:r>
+    </w:p>
+    <w:p>
+      <w:r>
+        <w:drawing>
+          <wp:inline distT="0" distB="0" distL="0" distR="0">
+            <wp:extent cx="3714750" cy="4762500"/>
+            <wp:effectExtent t="0" r="0" b="0" l="0"/>
+            <wp:docPr id="8" name="Vorher" descr="Vorher: html" title="Vorher"/>
+            <wp:cNvGraphicFramePr>
+              <a:graphicFrameLocks xmlns:a="http://schemas.openxmlformats.org/drawingml/2006/main" noChangeAspect="1"/>
+            </wp:cNvGraphicFramePr>
+            <a:graphic xmlns:a="http://schemas.openxmlformats.org/drawingml/2006/main">
+              <a:graphicData uri="http://schemas.openxmlformats.org/drawingml/2006/picture">
+                <pic:pic xmlns:pic="http://schemas.openxmlformats.org/drawingml/2006/picture">
+                  <pic:nvPicPr>
+                    <pic:cNvPr id="0" name="" descr=""/>
+                    <pic:cNvPicPr>
+                      <a:picLocks noChangeAspect="1" noChangeArrowheads="1"/>
+                    </pic:cNvPicPr>
+                  </pic:nvPicPr>
+                  <pic:blipFill>
+                    <a:blip r:embed="rId11" cstate="none"/>
+                    <a:srcRect/>
+                    <a:stretch>
+                      <a:fillRect/>
+                    </a:stretch>
+                  </pic:blipFill>
+                  <pic:spPr bwMode="auto">
+                    <a:xfrm>
+                      <a:off x="0" y="0"/>
+                      <a:ext cx="3714750" cy="4762500"/>
+                    </a:xfrm>
+                    <a:prstGeom prst="rect">
+                      <a:avLst/>
+                    </a:prstGeom>
+                  </pic:spPr>
+                </pic:pic>
+              </a:graphicData>
+            </a:graphic>
+          </wp:inline>
+        </w:drawing>
+      </w:r>
+    </w:p>
+    <w:p>
+      <w:pPr>
+        <w:spacing w:after="120"/>
+      </w:pPr>
+      <w:r>
+        <w:rPr>
+          <w:i/>
+          <w:iCs/>
+        </w:rPr>
+        <w:t xml:space="preserve">Nachher</w:t>
+      </w:r>
+    </w:p>
+    <w:p>
+      <w:r>
+        <w:drawing>
+          <wp:inline distT="0" distB="0" distL="0" distR="0">
+            <wp:extent cx="3714750" cy="4762500"/>
+            <wp:effectExtent t="0" r="0" b="0" l="0"/>
+            <wp:docPr id="9" name="Nachher" descr="Nachher: html" title="Nachher"/>
+            <wp:cNvGraphicFramePr>
+              <a:graphicFrameLocks xmlns:a="http://schemas.openxmlformats.org/drawingml/2006/main" noChangeAspect="1"/>
+            </wp:cNvGraphicFramePr>
+            <a:graphic xmlns:a="http://schemas.openxmlformats.org/drawingml/2006/main">
+              <a:graphicData uri="http://schemas.openxmlformats.org/drawingml/2006/picture">
+                <pic:pic xmlns:pic="http://schemas.openxmlformats.org/drawingml/2006/picture">
+                  <pic:nvPicPr>
+                    <pic:cNvPr id="0" name="" descr=""/>
+                    <pic:cNvPicPr>
+                      <a:picLocks noChangeAspect="1" noChangeArrowheads="1"/>
+                    </pic:cNvPicPr>
+                  </pic:nvPicPr>
+                  <pic:blipFill>
+                    <a:blip r:embed="rId11" cstate="none"/>
+                    <a:srcRect/>
+                    <a:stretch>
+                      <a:fillRect/>
+                    </a:stretch>
+                  </pic:blipFill>
+                  <pic:spPr bwMode="auto">
+                    <a:xfrm>
+                      <a:off x="0" y="0"/>
+                      <a:ext cx="3714750" cy="4762500"/>
+                    </a:xfrm>
+                    <a:prstGeom prst="rect">
+                      <a:avLst/>
+                    </a:prstGeom>
+                  </pic:spPr>
+                </pic:pic>
+              </a:graphicData>
+            </a:graphic>
+          </wp:inline>
+        </w:drawing>
+      </w:r>
+    </w:p>
+    <w:p>
+      <w:pPr>
+        <w:spacing w:after="120"/>
+      </w:pPr>
+      <w:r>
+        <w:rPr>
+          <w:b/>
+          <w:bCs/>
+        </w:rPr>
+        <w:t xml:space="preserve">Links must have discernible text (a)</w:t>
+      </w:r>
+    </w:p>
+    <w:p>
+      <w:pPr>
+        <w:spacing w:after="120"/>
+      </w:pPr>
+      <w:r>
+        <w:rPr>
+          <w:i/>
+          <w:iCs/>
+        </w:rPr>
+        <w:t xml:space="preserve">Vorher</w:t>
+      </w:r>
+    </w:p>
+    <w:p>
+      <w:r>
+        <w:drawing>
+          <wp:inline distT="0" distB="0" distL="0" distR="0">
+            <wp:extent cx="381000" cy="409575"/>
+            <wp:effectExtent t="0" r="0" b="0" l="0"/>
+            <wp:docPr id="10" name="Vorher" descr="Vorher: a" title="Vorher"/>
+            <wp:cNvGraphicFramePr>
+              <a:graphicFrameLocks xmlns:a="http://schemas.openxmlformats.org/drawingml/2006/main" noChangeAspect="1"/>
+            </wp:cNvGraphicFramePr>
+            <a:graphic xmlns:a="http://schemas.openxmlformats.org/drawingml/2006/main">
+              <a:graphicData uri="http://schemas.openxmlformats.org/drawingml/2006/picture">
+                <pic:pic xmlns:pic="http://schemas.openxmlformats.org/drawingml/2006/picture">
+                  <pic:nvPicPr>
+                    <pic:cNvPr id="0" name="" descr=""/>
+                    <pic:cNvPicPr>
+                      <a:picLocks noChangeAspect="1" noChangeArrowheads="1"/>
+                    </pic:cNvPicPr>
+                  </pic:nvPicPr>
+                  <pic:blipFill>
+                    <a:blip r:embed="rId12" cstate="none"/>
+                    <a:srcRect/>
+                    <a:stretch>
+                      <a:fillRect/>
+                    </a:stretch>
+                  </pic:blipFill>
+                  <pic:spPr bwMode="auto">
+                    <a:xfrm>
+                      <a:off x="0" y="0"/>
+                      <a:ext cx="381000" cy="409575"/>
+                    </a:xfrm>
+                    <a:prstGeom prst="rect">
+                      <a:avLst/>
+                    </a:prstGeom>
+                  </pic:spPr>
+                </pic:pic>
+              </a:graphicData>
+            </a:graphic>
+          </wp:inline>
+        </w:drawing>
+      </w:r>
+    </w:p>
+    <w:p>
+      <w:pPr>
+        <w:spacing w:after="120"/>
+      </w:pPr>
+      <w:r>
+        <w:rPr>
+          <w:i/>
+          <w:iCs/>
+        </w:rPr>
+        <w:t xml:space="preserve">Nachher</w:t>
+      </w:r>
+    </w:p>
+    <w:p>
+      <w:r>
+        <w:drawing>
+          <wp:inline distT="0" distB="0" distL="0" distR="0">
+            <wp:extent cx="1162050" cy="409575"/>
+            <wp:effectExtent t="0" r="0" b="0" l="0"/>
+            <wp:docPr id="11" name="Nachher" descr="Nachher: a" title="Nachher"/>
+            <wp:cNvGraphicFramePr>
+              <a:graphicFrameLocks xmlns:a="http://schemas.openxmlformats.org/drawingml/2006/main" noChangeAspect="1"/>
+            </wp:cNvGraphicFramePr>
+            <a:graphic xmlns:a="http://schemas.openxmlformats.org/drawingml/2006/main">
+              <a:graphicData uri="http://schemas.openxmlformats.org/drawingml/2006/picture">
+                <pic:pic xmlns:pic="http://schemas.openxmlformats.org/drawingml/2006/picture">
+                  <pic:nvPicPr>
+                    <pic:cNvPr id="0" name="" descr=""/>
+                    <pic:cNvPicPr>
+                      <a:picLocks noChangeAspect="1" noChangeArrowheads="1"/>
+                    </pic:cNvPicPr>
+                  </pic:nvPicPr>
+                  <pic:blipFill>
+                    <a:blip r:embed="rId13" cstate="none"/>
+                    <a:srcRect/>
+                    <a:stretch>
+                      <a:fillRect/>
+                    </a:stretch>
+                  </pic:blipFill>
+                  <pic:spPr bwMode="auto">
+                    <a:xfrm>
+                      <a:off x="0" y="0"/>
+                      <a:ext cx="1162050" cy="409575"/>
+                    </a:xfrm>
+                    <a:prstGeom prst="rect">
+                      <a:avLst/>
+                    </a:prstGeom>
+                  </pic:spPr>
+                </pic:pic>
+              </a:graphicData>
+            </a:graphic>
+          </wp:inline>
+        </w:drawing>
+      </w:r>
     </w:p>
     <w:p>
       <w:pPr>

</xml_diff>